<commit_message>
Fix malformed XML in v4 docx Total row
The Dimension Summary table's Total row passed raw
`{ children: [P(...)] }` objects as cell contents instead of Paragraph
instances. docx-js couldn't serialize the raw objects and emitted
literal `<children><rootKey>w:p</rootKey></children>` garbage into
document.xml, which Word rejected as invalid WordprocessingML.

Replaced with plain Paragraph instances. XML now parses clean with
zero garbage markers, 552 paragraphs, 31 tables.

Co-Authored-By: Claude Opus 4.7 (1M context) <noreply@anthropic.com>
</commit_message>
<xml_diff>
--- a/rubric/Interva_CoE_Physician_Selection_Rubric_v4.docx
+++ b/rubric/Interva_CoE_Physician_Selection_Rubric_v4.docx
@@ -1699,10 +1699,15 @@
             </w:tcMar>
             <w:vAlign w:val="top"/>
           </w:tcPr>
-          <children>
-            <rootKey>w:p</rootKey>
-          </children>
-          <w:p/>
+          <w:p>
+            <w:r>
+              <w:rPr>
+                <w:b/>
+                <w:bCs/>
+              </w:rPr>
+              <w:t xml:space="preserve">Total</w:t>
+            </w:r>
+          </w:p>
         </w:tc>
         <w:tc>
           <w:tcPr>
@@ -1721,10 +1726,15 @@
             </w:tcMar>
             <w:vAlign w:val="top"/>
           </w:tcPr>
-          <children>
-            <rootKey>w:p</rootKey>
-          </children>
-          <w:p/>
+          <w:p>
+            <w:r>
+              <w:rPr>
+                <w:b/>
+                <w:bCs/>
+              </w:rPr>
+              <w:t xml:space="preserve">93</w:t>
+            </w:r>
+          </w:p>
         </w:tc>
         <w:tc>
           <w:tcPr>

</xml_diff>